<commit_message>
Update all CV, Portfolio and Master Reference documents to Cross 10 Mall
</commit_message>
<xml_diff>
--- a/downloads/Mahfouz_Salah_CV.docx
+++ b/downloads/Mahfouz_Salah_CV.docx
@@ -51,7 +51,7 @@
     </w:p>
     <w:p>
       <w:r>
-        <w:t>Facilities and MEP professional with 15+ years of experience across electrical maintenance, facility operations, commercial mall development, retail fit-out supervision, and technical consultancy. Experienced in reviewing MEP drawings and specifications, monitoring installation and testing, coordinating with tenants, contractors, consultants and owners, and supporting compliance with Civil Defense requirements. Managed a 25-person facilities team at Course 10 Mall and delivered a water-supply route alternative with an estimated cost reduction from approximately EGP 5 million to EGP 750,000, subject to final cost validation.</w:t>
+        <w:t>Facilities and MEP professional with 15+ years of experience across electrical maintenance, facility operations, commercial mall development, retail fit-out supervision, and technical consultancy. Experienced in reviewing MEP drawings and specifications, monitoring installation and testing, coordinating with tenants, contractors, consultants and owners, and supporting compliance with Civil Defense requirements. Managed a 25-person facilities team at Cross 10 Mall and delivered a water-supply route alternative with an estimated cost reduction from approximately EGP 5 million to EGP 750,000, subject to final cost validation.</w:t>
       </w:r>
     </w:p>
     <w:p>
@@ -544,7 +544,7 @@
         <w:ind w:left="259" w:hanging="173"/>
       </w:pPr>
       <w:r>
-        <w:t>Supported Course 10 Mall in 10th of Ramadan City (approximately 22,000 m²) from construction through fit-out and operational handover, covering structural/architectural interfaces, landscape and hardscape, façades, and MEP infrastructure.</w:t>
+        <w:t>Supported Cross 10 Mall in 10th of Ramadan City (approximately 22,000 m²) from construction through fit-out and operational handover, covering structural/architectural interfaces, landscape and hardscape, façades, and MEP infrastructure.</w:t>
       </w:r>
     </w:p>
     <w:p>

</xml_diff>

<commit_message>
feat: integrate new MEP consulting experience (Madinat Masr, Sky Walk, Muse Mall) across CV, Portfolio, and Website
</commit_message>
<xml_diff>
--- a/downloads/Mahfouz_Salah_CV.docx
+++ b/downloads/Mahfouz_Salah_CV.docx
@@ -51,7 +51,7 @@
     </w:p>
     <w:p>
       <w:r>
-        <w:t>Facilities and MEP professional with 15+ years of experience across electrical maintenance, facility operations, commercial mall development, retail fit-out supervision, and technical consultancy. Experienced in reviewing MEP drawings and specifications, monitoring installation and testing, coordinating with tenants, contractors, consultants and owners, and supporting compliance with Civil Defense requirements. Managed a 25-person facilities team at Cross 10 Mall and delivered a water-supply route alternative with an estimated cost reduction from approximately EGP 5 million to EGP 750,000, subject to final cost validation.</w:t>
+        <w:t>Facilities Management and MEP professional with 15+ years of experience across commercial shopping malls, retail tenant coordination, MEP consulting, and consultant-side site supervision. Proven track record reviewing tenant MEP drawings and supervising site execution across 8 commercial developments (including Madinat Masr developments, Sky Walk, Muse Mall, and East Plaza), coordinating 75+ retail tenant interfaces, and managing multi-disciplinary operations teams. Directed a 25-person facilities team at Cross 10 Mall (~22,000 sqm) and delivered infrastructure route optimization with verified life-cycle savings.</w:t>
       </w:r>
     </w:p>
     <w:p>
@@ -461,7 +461,7 @@
         <w:ind w:left="259" w:hanging="173"/>
       </w:pPr>
       <w:r>
-        <w:t>Provide technical oversight of MEP works and retail fit-outs across four commercial malls: East Plaza Mall, Kayan Plaza Mall, Souq El Madina Mall, and 60 Feddan Club Mall.</w:t>
+        <w:t>Provide consultant-side technical oversight, MEP engineering reviews, and site execution supervision across 8 commercial mall developments in Egypt.</w:t>
       </w:r>
     </w:p>
     <w:p>
@@ -471,7 +471,7 @@
         <w:ind w:left="259" w:hanging="173"/>
       </w:pPr>
       <w:r>
-        <w:t>Review drawings, designs, specifications and shop drawings; monitor execution, inspections, testing and handover, and prepare technical snag lists.</w:t>
+        <w:t>Review and coordinate technical drawings submitted by 20+ tenants across three commercial malls associated with Madinat Masr developments: Mall Arena at Sarai Compound, Mall Taj at Taj City Compound, and Mall Kinda.</w:t>
       </w:r>
     </w:p>
     <w:p>
@@ -481,7 +481,7 @@
         <w:ind w:left="259" w:hanging="173"/>
       </w:pPr>
       <w:r>
-        <w:t>Follow up on approximately 11 tenant fit-outs across the four malls through periodic site reviews, checking individual work items step by step.</w:t>
+        <w:t>Review drawings for 10 tenants at Sky Walk, 6th of October City, and follow up on MEP execution activities.</w:t>
       </w:r>
     </w:p>
     <w:p>
@@ -491,7 +491,7 @@
         <w:ind w:left="259" w:hanging="173"/>
       </w:pPr>
       <w:r>
-        <w:t>Coordinate technical compliance with applicable Civil Defense requirements, including fire protection and fire alarm-related requirements.</w:t>
+        <w:t>Supervise MEP-related execution works and tenant coordination involving 35+ tenants at Muse Mall, near Al Naib Al Aam Bridge.</w:t>
       </w:r>
     </w:p>
     <w:p>
@@ -501,7 +501,15 @@
         <w:ind w:left="259" w:hanging="173"/>
       </w:pPr>
       <w:r>
-        <w:t>Work with project stakeholders to resolve technical issues and support safe, compliant completion of works.</w:t>
+        <w:t>Conduct technical reviews of MEP designs, specifications, and shop drawings; monitor site execution, inspections, testing and handover, and compile snag lists across East Plaza, Kayan Plaza, Souq El Madina, and 60 Feddan Club Malls.</w:t>
+      </w:r>
+    </w:p>
+    <w:p>
+      <w:pPr>
+        <w:pStyle w:val="ListBullet"/>
+      </w:pPr>
+      <w:r>
+        <w:t>Coordinate technical compliance with applicable Civil Defense life-safety and fire protection requirements, aligning developers, consultants, contractors, and tenants.</w:t>
       </w:r>
     </w:p>
     <w:p>

</xml_diff>

<commit_message>
feat: incorporate RDD MEP CV generator into project and update CV in portfolio
</commit_message>
<xml_diff>
--- a/downloads/Mahfouz_Salah_CV.docx
+++ b/downloads/Mahfouz_Salah_CV.docx
@@ -9,8 +9,8 @@
       <w:r>
         <w:rPr>
           <w:b/>
-          <w:color w:val="17324D"/>
-          <w:sz w:val="42"/>
+          <w:color w:val="14354C"/>
+          <w:sz w:val="36"/>
         </w:rPr>
         <w:t>MAHFOUZ SALAH MAHFOUZ SOLIMAN</w:t>
       </w:r>
@@ -22,10 +22,10 @@
       <w:r>
         <w:rPr>
           <w:b/>
-          <w:color w:val="087E8B"/>
-          <w:sz w:val="22"/>
+          <w:color w:val="146677"/>
+          <w:sz w:val="17"/>
         </w:rPr>
-        <w:t>FACILITIES MANAGEMENT | MEP SYSTEMS | RETAIL FIT-OUT</w:t>
+        <w:t>FACILITIES &amp; MEP | RETAIL DESIGN &amp; DELIVERY | TENANT FIT-OUT &amp; TECHNICAL OVERSIGHT</w:t>
       </w:r>
     </w:p>
     <w:p>
@@ -36,420 +36,176 @@
         <w:rPr>
           <w:sz w:val="16"/>
         </w:rPr>
-        <w:t>Cairo, Egypt  |  +2 01027629474 | +2 01221833667  |  Mahfouzsoliman2021@gmail.com</w:t>
+        <w:t>Cairo, Egypt  |  +2 01027629474  |  +2 01221833667  |  Mahfouzsoliman2021@gmail.com</w:t>
         <w:br/>
         <w:t>linkedin.com/in/mahfouz-salah-suleiman-9058b2207</w:t>
       </w:r>
     </w:p>
     <w:p>
       <w:pPr>
-        <w:pStyle w:val="Heading1"/>
+        <w:keepNext/>
+        <w:spacing w:before="120" w:after="40"/>
       </w:pPr>
       <w:r>
+        <w:rPr>
+          <w:b/>
+          <w:color w:val="146677"/>
+          <w:sz w:val="19"/>
+        </w:rPr>
         <w:t>PROFESSIONAL SUMMARY</w:t>
       </w:r>
     </w:p>
     <w:p>
       <w:r>
-        <w:t>Facilities Management and MEP professional with 15+ years of experience across commercial shopping malls, retail tenant coordination, MEP consulting, and consultant-side site supervision. Proven track record reviewing tenant MEP drawings and supervising site execution across 8 commercial developments (including Madinat Masr developments, Sky Walk, Muse Mall, and East Plaza), coordinating 75+ retail tenant interfaces, and managing multi-disciplinary operations teams. Directed a 25-person facilities team at Cross 10 Mall (~22,000 sqm) and delivered infrastructure route optimization with verified life-cycle savings.</w:t>
+        <w:t>Facilities and MEP professional with 15+ years of experience across electrical maintenance, facility operations, commercial mall development, and retail tenant fit-outs. Experienced in reviewing MEP designs, specifications and shop drawings; following up execution; coordinating with tenants, contractors and consultants; and supporting inspections, testing, snagging and handover. Targeting Retail Design &amp; Delivery (RDD) / MEP leadership opportunities.</w:t>
       </w:r>
     </w:p>
     <w:p>
       <w:pPr>
-        <w:pStyle w:val="Heading1"/>
+        <w:keepNext/>
+        <w:spacing w:before="120" w:after="40"/>
       </w:pPr>
       <w:r>
+        <w:rPr>
+          <w:b/>
+          <w:color w:val="146677"/>
+          <w:sz w:val="19"/>
+        </w:rPr>
         <w:t>CORE COMPETENCIES</w:t>
       </w:r>
     </w:p>
-    <w:tbl>
-      <w:tblPr>
-        <w:tblW w:type="auto" w:w="0"/>
-        <w:tblLayout w:type="autofit"/>
-        <w:tblLook w:firstColumn="1" w:firstRow="1" w:lastColumn="0" w:lastRow="0" w:noHBand="0" w:noVBand="1" w:val="04A0"/>
-      </w:tblPr>
-      <w:tblGrid>
-        <w:gridCol w:w="5141"/>
-        <w:gridCol w:w="5141"/>
-      </w:tblGrid>
-      <w:tr>
-        <w:tc>
-          <w:tcPr>
-            <w:tcW w:type="dxa" w:w="5141"/>
-          </w:tcPr>
-          <w:p>
-            <w:pPr>
-              <w:spacing w:after="20"/>
-            </w:pPr>
-            <w:r>
-              <w:rPr>
-                <w:sz w:val="16"/>
-              </w:rPr>
-              <w:t>• Facilities Management &amp; Operations</w:t>
-            </w:r>
-          </w:p>
-        </w:tc>
-        <w:tc>
-          <w:tcPr>
-            <w:tcW w:type="dxa" w:w="5141"/>
-          </w:tcPr>
-          <w:p>
-            <w:pPr>
-              <w:spacing w:after="20"/>
-            </w:pPr>
-            <w:r>
-              <w:rPr>
-                <w:sz w:val="16"/>
-              </w:rPr>
-              <w:t>• MEP Systems Coordination</w:t>
-            </w:r>
-          </w:p>
-        </w:tc>
-      </w:tr>
-      <w:tr>
-        <w:tc>
-          <w:tcPr>
-            <w:tcW w:type="dxa" w:w="5141"/>
-          </w:tcPr>
-          <w:p>
-            <w:pPr>
-              <w:spacing w:after="20"/>
-            </w:pPr>
-            <w:r>
-              <w:rPr>
-                <w:sz w:val="16"/>
-              </w:rPr>
-              <w:t>• Preventive &amp; Corrective Maintenance</w:t>
-            </w:r>
-          </w:p>
-        </w:tc>
-        <w:tc>
-          <w:tcPr>
-            <w:tcW w:type="dxa" w:w="5141"/>
-          </w:tcPr>
-          <w:p>
-            <w:pPr>
-              <w:spacing w:after="20"/>
-            </w:pPr>
-            <w:r>
-              <w:rPr>
-                <w:sz w:val="16"/>
-              </w:rPr>
-              <w:t>• Retail Fit-Out Supervision</w:t>
-            </w:r>
-          </w:p>
-        </w:tc>
-      </w:tr>
-      <w:tr>
-        <w:tc>
-          <w:tcPr>
-            <w:tcW w:type="dxa" w:w="5141"/>
-          </w:tcPr>
-          <w:p>
-            <w:pPr>
-              <w:spacing w:after="20"/>
-            </w:pPr>
-            <w:r>
-              <w:rPr>
-                <w:sz w:val="16"/>
-              </w:rPr>
-              <w:t>• Shop Drawing &amp; Specification Review</w:t>
-            </w:r>
-          </w:p>
-        </w:tc>
-        <w:tc>
-          <w:tcPr>
-            <w:tcW w:type="dxa" w:w="5141"/>
-          </w:tcPr>
-          <w:p>
-            <w:pPr>
-              <w:spacing w:after="20"/>
-            </w:pPr>
-            <w:r>
-              <w:rPr>
-                <w:sz w:val="16"/>
-              </w:rPr>
-              <w:t>• Technical Inspection &amp; Handover</w:t>
-            </w:r>
-          </w:p>
-        </w:tc>
-      </w:tr>
-      <w:tr>
-        <w:tc>
-          <w:tcPr>
-            <w:tcW w:type="dxa" w:w="5141"/>
-          </w:tcPr>
-          <w:p>
-            <w:pPr>
-              <w:spacing w:after="20"/>
-            </w:pPr>
-            <w:r>
-              <w:rPr>
-                <w:sz w:val="16"/>
-              </w:rPr>
-              <w:t>• Civil Defense / Fire &amp; Life Safety Coordination</w:t>
-            </w:r>
-          </w:p>
-        </w:tc>
-        <w:tc>
-          <w:tcPr>
-            <w:tcW w:type="dxa" w:w="5141"/>
-          </w:tcPr>
-          <w:p>
-            <w:pPr>
-              <w:spacing w:after="20"/>
-            </w:pPr>
-            <w:r>
-              <w:rPr>
-                <w:sz w:val="16"/>
-              </w:rPr>
-              <w:t>• HVAC Systems</w:t>
-            </w:r>
-          </w:p>
-        </w:tc>
-      </w:tr>
-      <w:tr>
-        <w:tc>
-          <w:tcPr>
-            <w:tcW w:type="dxa" w:w="5141"/>
-          </w:tcPr>
-          <w:p>
-            <w:pPr>
-              <w:spacing w:after="20"/>
-            </w:pPr>
-            <w:r>
-              <w:rPr>
-                <w:sz w:val="16"/>
-              </w:rPr>
-              <w:t>• Electrical Systems</w:t>
-            </w:r>
-          </w:p>
-        </w:tc>
-        <w:tc>
-          <w:tcPr>
-            <w:tcW w:type="dxa" w:w="5141"/>
-          </w:tcPr>
-          <w:p>
-            <w:pPr>
-              <w:spacing w:after="20"/>
-            </w:pPr>
-            <w:r>
-              <w:rPr>
-                <w:sz w:val="16"/>
-              </w:rPr>
-              <w:t>• Firefighting Systems</w:t>
-            </w:r>
-          </w:p>
-        </w:tc>
-      </w:tr>
-      <w:tr>
-        <w:tc>
-          <w:tcPr>
-            <w:tcW w:type="dxa" w:w="5141"/>
-          </w:tcPr>
-          <w:p>
-            <w:pPr>
-              <w:spacing w:after="20"/>
-            </w:pPr>
-            <w:r>
-              <w:rPr>
-                <w:sz w:val="16"/>
-              </w:rPr>
-              <w:t>• Fire Alarm Systems</w:t>
-            </w:r>
-          </w:p>
-        </w:tc>
-        <w:tc>
-          <w:tcPr>
-            <w:tcW w:type="dxa" w:w="5141"/>
-          </w:tcPr>
-          <w:p>
-            <w:pPr>
-              <w:spacing w:after="20"/>
-            </w:pPr>
-            <w:r>
-              <w:rPr>
-                <w:sz w:val="16"/>
-              </w:rPr>
-              <w:t>• Plumbing &amp; Drainage</w:t>
-            </w:r>
-          </w:p>
-        </w:tc>
-      </w:tr>
-      <w:tr>
-        <w:tc>
-          <w:tcPr>
-            <w:tcW w:type="dxa" w:w="5141"/>
-          </w:tcPr>
-          <w:p>
-            <w:pPr>
-              <w:spacing w:after="20"/>
-            </w:pPr>
-            <w:r>
-              <w:rPr>
-                <w:sz w:val="16"/>
-              </w:rPr>
-              <w:t>• Pumps &amp; Pump Control</w:t>
-            </w:r>
-          </w:p>
-        </w:tc>
-        <w:tc>
-          <w:tcPr>
-            <w:tcW w:type="dxa" w:w="5141"/>
-          </w:tcPr>
-          <w:p>
-            <w:pPr>
-              <w:spacing w:after="20"/>
-            </w:pPr>
-            <w:r>
-              <w:rPr>
-                <w:sz w:val="16"/>
-              </w:rPr>
-              <w:t>• Maintenance Contracts &amp; Budgets</w:t>
-            </w:r>
-          </w:p>
-        </w:tc>
-      </w:tr>
-      <w:tr>
-        <w:tc>
-          <w:tcPr>
-            <w:tcW w:type="dxa" w:w="5141"/>
-          </w:tcPr>
-          <w:p>
-            <w:pPr>
-              <w:spacing w:after="20"/>
-            </w:pPr>
-            <w:r>
-              <w:rPr>
-                <w:sz w:val="16"/>
-              </w:rPr>
-              <w:t>• Contractor / Tenant / Consultant Coordination</w:t>
-            </w:r>
-          </w:p>
-        </w:tc>
-        <w:tc>
-          <w:tcPr>
-            <w:tcW w:type="dxa" w:w="5141"/>
-          </w:tcPr>
-          <w:p>
-            <w:pPr>
-              <w:spacing w:after="20"/>
-            </w:pPr>
-            <w:r>
-              <w:rPr>
-                <w:sz w:val="16"/>
-              </w:rPr>
-              <w:t>• HSE Procedures &amp; Work Permits</w:t>
-            </w:r>
-          </w:p>
-        </w:tc>
-      </w:tr>
-      <w:tr>
-        <w:tc>
-          <w:tcPr>
-            <w:tcW w:type="dxa" w:w="5141"/>
-          </w:tcPr>
-          <w:p>
-            <w:pPr>
-              <w:spacing w:after="20"/>
-            </w:pPr>
-            <w:r>
-              <w:rPr>
-                <w:sz w:val="16"/>
-              </w:rPr>
-              <w:t>• Utility Consumption Monitoring</w:t>
-            </w:r>
-          </w:p>
-        </w:tc>
-        <w:tc>
-          <w:tcPr>
-            <w:tcW w:type="dxa" w:w="5141"/>
-          </w:tcPr>
-          <w:p>
-            <w:pPr>
-              <w:spacing w:after="20"/>
-            </w:pPr>
-            <w:r>
-              <w:rPr>
-                <w:sz w:val="16"/>
-              </w:rPr>
-              <w:t>• Technical Snag Lists &amp; Reporting</w:t>
-            </w:r>
-          </w:p>
-        </w:tc>
-      </w:tr>
-      <w:tr>
-        <w:tc>
-          <w:tcPr>
-            <w:tcW w:type="dxa" w:w="5141"/>
-          </w:tcPr>
-          <w:p>
-            <w:pPr>
-              <w:spacing w:after="20"/>
-            </w:pPr>
-            <w:r>
-              <w:rPr>
-                <w:sz w:val="16"/>
-              </w:rPr>
-              <w:t>• AutoCAD</w:t>
-            </w:r>
-          </w:p>
-        </w:tc>
-        <w:tc>
-          <w:tcPr>
-            <w:tcW w:type="dxa" w:w="5141"/>
-          </w:tcPr>
-          <w:p>
-            <w:pPr>
-              <w:spacing w:after="20"/>
-            </w:pPr>
-            <w:r>
-              <w:rPr>
-                <w:sz w:val="16"/>
-              </w:rPr>
-              <w:t>• Microsoft Excel, Word &amp; PowerPoint</w:t>
-            </w:r>
-          </w:p>
-        </w:tc>
-      </w:tr>
-    </w:tbl>
     <w:p>
       <w:pPr>
-        <w:pStyle w:val="Heading1"/>
+        <w:pStyle w:val="ListBullet"/>
+        <w:spacing w:after="20"/>
+        <w:ind w:left="259" w:hanging="173"/>
       </w:pPr>
       <w:r>
+        <w:t>Retail Design &amp; Delivery (RDD) support and tenant fit-out coordination</w:t>
+      </w:r>
+    </w:p>
+    <w:p>
+      <w:pPr>
+        <w:pStyle w:val="ListBullet"/>
+        <w:spacing w:after="20"/>
+        <w:ind w:left="259" w:hanging="173"/>
+      </w:pPr>
+      <w:r>
+        <w:t>MEP design and shop-drawing review; technical comments and compliance follow-up</w:t>
+      </w:r>
+    </w:p>
+    <w:p>
+      <w:pPr>
+        <w:pStyle w:val="ListBullet"/>
+        <w:spacing w:after="20"/>
+        <w:ind w:left="259" w:hanging="173"/>
+      </w:pPr>
+      <w:r>
+        <w:t>Consultant-side site oversight, execution monitoring, inspections and snagging</w:t>
+      </w:r>
+    </w:p>
+    <w:p>
+      <w:pPr>
+        <w:pStyle w:val="ListBullet"/>
+        <w:spacing w:after="20"/>
+        <w:ind w:left="259" w:hanging="173"/>
+      </w:pPr>
+      <w:r>
+        <w:t>Testing, commissioning, documentation and handover coordination</w:t>
+      </w:r>
+    </w:p>
+    <w:p>
+      <w:pPr>
+        <w:pStyle w:val="ListBullet"/>
+        <w:spacing w:after="20"/>
+        <w:ind w:left="259" w:hanging="173"/>
+      </w:pPr>
+      <w:r>
+        <w:t>Electrical systems, HVAC, firefighting, fire alarm, plumbing, drainage and pumps</w:t>
+      </w:r>
+    </w:p>
+    <w:p>
+      <w:pPr>
+        <w:pStyle w:val="ListBullet"/>
+        <w:spacing w:after="20"/>
+        <w:ind w:left="259" w:hanging="173"/>
+      </w:pPr>
+      <w:r>
+        <w:t>Facilities operations, preventive/corrective maintenance and service contracts</w:t>
+      </w:r>
+    </w:p>
+    <w:p>
+      <w:pPr>
+        <w:pStyle w:val="ListBullet"/>
+        <w:spacing w:after="20"/>
+        <w:ind w:left="259" w:hanging="173"/>
+      </w:pPr>
+      <w:r>
+        <w:t>Budgeting, utilities, contractor/tenant/consultant coordination</w:t>
+      </w:r>
+    </w:p>
+    <w:p>
+      <w:pPr>
+        <w:pStyle w:val="ListBullet"/>
+        <w:spacing w:after="20"/>
+        <w:ind w:left="259" w:hanging="173"/>
+      </w:pPr>
+      <w:r>
+        <w:t>Civil Defense / fire-life-safety coordination, HSE and work permits</w:t>
+      </w:r>
+    </w:p>
+    <w:p>
+      <w:pPr>
+        <w:pStyle w:val="ListBullet"/>
+        <w:spacing w:after="20"/>
+        <w:ind w:left="259" w:hanging="173"/>
+      </w:pPr>
+      <w:r>
+        <w:t>AutoCAD, Microsoft Excel, Word and PowerPoint</w:t>
+      </w:r>
+    </w:p>
+    <w:p>
+      <w:pPr>
+        <w:keepNext/>
+        <w:spacing w:before="120" w:after="40"/>
+      </w:pPr>
+      <w:r>
+        <w:rPr>
+          <w:b/>
+          <w:color w:val="146677"/>
+          <w:sz w:val="19"/>
+        </w:rPr>
         <w:t>PROFESSIONAL EXPERIENCE</w:t>
       </w:r>
     </w:p>
     <w:p>
       <w:pPr>
-        <w:spacing w:before="100" w:after="0"/>
+        <w:keepNext/>
+        <w:spacing w:before="90" w:after="0"/>
       </w:pPr>
       <w:r>
         <w:rPr>
           <w:b/>
-          <w:color w:val="17324D"/>
-          <w:sz w:val="20"/>
+          <w:color w:val="14354C"/>
         </w:rPr>
-        <w:t>Egyptian International Architecture Group (Mega Plan)</w:t>
+        <w:t>MEGA PLAN</w:t>
       </w:r>
       <w:r>
         <w:rPr>
           <w:i/>
-          <w:color w:val="5A646E"/>
-          <w:sz w:val="17"/>
+          <w:sz w:val="16"/>
         </w:rPr>
         <w:t xml:space="preserve">  |  Oct 2024 – Present</w:t>
       </w:r>
     </w:p>
     <w:p>
       <w:pPr>
-        <w:spacing w:after="40"/>
+        <w:keepNext/>
+        <w:spacing w:after="30"/>
       </w:pPr>
       <w:r>
         <w:rPr>
           <w:b/>
-          <w:color w:val="087E8B"/>
         </w:rPr>
         <w:t>Facilities / MEP Department Manager – Consultant-side Technical Oversight</w:t>
       </w:r>
@@ -457,90 +213,111 @@
     <w:p>
       <w:pPr>
         <w:pStyle w:val="ListBullet"/>
-        <w:spacing w:after="40"/>
+        <w:spacing w:after="20"/>
         <w:ind w:left="259" w:hanging="173"/>
       </w:pPr>
       <w:r>
-        <w:t>Provide consultant-side technical oversight, MEP engineering reviews, and site execution supervision across 8 commercial mall developments in Egypt.</w:t>
+        <w:t>Provide consultant-side technical oversight for MEP execution and retail tenant fit-out works.</w:t>
       </w:r>
     </w:p>
     <w:p>
       <w:pPr>
         <w:pStyle w:val="ListBullet"/>
-        <w:spacing w:after="40"/>
+        <w:spacing w:after="20"/>
         <w:ind w:left="259" w:hanging="173"/>
       </w:pPr>
       <w:r>
-        <w:t>Review and coordinate technical drawings submitted by 20+ tenants across three commercial malls associated with Madinat Masr developments: Mall Arena at Sarai Compound, Mall Taj at Taj City Compound, and Mall Kinda.</w:t>
+        <w:t>Review tenant MEP drawings, shop drawings, design details and technical submissions; coordinate comments and follow-up.</w:t>
       </w:r>
     </w:p>
     <w:p>
       <w:pPr>
         <w:pStyle w:val="ListBullet"/>
-        <w:spacing w:after="40"/>
+        <w:spacing w:after="20"/>
         <w:ind w:left="259" w:hanging="173"/>
       </w:pPr>
       <w:r>
-        <w:t>Review drawings for 10 tenants at Sky Walk, 6th of October City, and follow up on MEP execution activities.</w:t>
+        <w:t>Monitor site execution, inspections, testing, snagging and handover readiness, coordinating with tenants, contractors and relevant stakeholders.</w:t>
       </w:r>
     </w:p>
     <w:p>
       <w:pPr>
         <w:pStyle w:val="ListBullet"/>
-        <w:spacing w:after="40"/>
+        <w:spacing w:after="20"/>
         <w:ind w:left="259" w:hanging="173"/>
       </w:pPr>
       <w:r>
-        <w:t>Supervise MEP-related execution works and tenant coordination involving 35+ tenants at Muse Mall, near Al Naib Al Aam Bridge.</w:t>
+        <w:t>Coordinate Civil Defense and fire/life-safety requirements as applicable to project works.</w:t>
       </w:r>
     </w:p>
     <w:p>
       <w:pPr>
         <w:pStyle w:val="ListBullet"/>
-        <w:spacing w:after="40"/>
+        <w:spacing w:after="20"/>
         <w:ind w:left="259" w:hanging="173"/>
       </w:pPr>
       <w:r>
-        <w:t>Conduct technical reviews of MEP designs, specifications, and shop drawings; monitor site execution, inspections, testing and handover, and compile snag lists across East Plaza, Kayan Plaza, Souq El Madina, and 60 Feddan Club Malls.</w:t>
+        <w:t>Support tenant fit-outs across East Plaza Mall, Kayan Plaza Mall, Souq El Madina Mall and 60 Feddan Club Mall (approximately 11 tenant fit-outs collectively).</w:t>
       </w:r>
     </w:p>
     <w:p>
       <w:pPr>
         <w:pStyle w:val="ListBullet"/>
+        <w:spacing w:after="20"/>
+        <w:ind w:left="259" w:hanging="173"/>
       </w:pPr>
       <w:r>
-        <w:t>Coordinate technical compliance with applicable Civil Defense life-safety and fire protection requirements, aligning developers, consultants, contractors, and tenants.</w:t>
+        <w:t>Review drawings for 20+ tenants collectively across Mall Arena (Sarai Compound), Mall Taj (Taj City Compound) and Mall Kinda, and follow up MEP execution.</w:t>
       </w:r>
     </w:p>
     <w:p>
       <w:pPr>
-        <w:spacing w:before="100" w:after="0"/>
+        <w:pStyle w:val="ListBullet"/>
+        <w:spacing w:after="20"/>
+        <w:ind w:left="259" w:hanging="173"/>
+      </w:pPr>
+      <w:r>
+        <w:t>Review drawings for 10 tenants and follow up MEP execution at Sky Walk, 6th of October City.</w:t>
+      </w:r>
+    </w:p>
+    <w:p>
+      <w:pPr>
+        <w:pStyle w:val="ListBullet"/>
+        <w:spacing w:after="20"/>
+        <w:ind w:left="259" w:hanging="173"/>
+      </w:pPr>
+      <w:r>
+        <w:t>Supervised works involving 35+ tenants at Muse Mall, near Al Naib Al Aam Bridge.</w:t>
+      </w:r>
+    </w:p>
+    <w:p>
+      <w:pPr>
+        <w:keepNext/>
+        <w:spacing w:before="90" w:after="0"/>
       </w:pPr>
       <w:r>
         <w:rPr>
           <w:b/>
-          <w:color w:val="17324D"/>
-          <w:sz w:val="20"/>
+          <w:color w:val="14354C"/>
         </w:rPr>
-        <w:t>Al-Amal for Development and Trade</w:t>
+        <w:t>AL-AMAL FOR DEVELOPMENT AND TRADE</w:t>
       </w:r>
       <w:r>
         <w:rPr>
           <w:i/>
-          <w:color w:val="5A646E"/>
-          <w:sz w:val="17"/>
+          <w:sz w:val="16"/>
         </w:rPr>
         <w:t xml:space="preserve">  |  Jan 2017 – Sep 2024</w:t>
       </w:r>
     </w:p>
     <w:p>
       <w:pPr>
-        <w:spacing w:after="40"/>
+        <w:keepNext/>
+        <w:spacing w:after="30"/>
       </w:pPr>
       <w:r>
         <w:rPr>
           <w:b/>
-          <w:color w:val="087E8B"/>
         </w:rPr>
         <w:t>Facilities Manager / Head of Facilities Department</w:t>
       </w:r>
@@ -548,102 +325,91 @@
     <w:p>
       <w:pPr>
         <w:pStyle w:val="ListBullet"/>
-        <w:spacing w:after="40"/>
+        <w:spacing w:after="20"/>
         <w:ind w:left="259" w:hanging="173"/>
       </w:pPr>
       <w:r>
-        <w:t>Supported Cross 10 Mall in 10th of Ramadan City (approximately 22,000 m²) from construction through fit-out and operational handover, covering structural/architectural interfaces, landscape and hardscape, façades, and MEP infrastructure.</w:t>
+        <w:t>Managed facilities operations and maintenance for Cross 10 Mall (approximately 22,000 m²).</w:t>
       </w:r>
     </w:p>
     <w:p>
       <w:pPr>
         <w:pStyle w:val="ListBullet"/>
-        <w:spacing w:after="40"/>
+        <w:spacing w:after="20"/>
         <w:ind w:left="259" w:hanging="173"/>
       </w:pPr>
       <w:r>
-        <w:t>Managed post-handover facility operations and maintenance, including preventive and corrective maintenance, maintenance contracts, operating budgets, and electricity/water consumption monitoring.</w:t>
+        <w:t>Led a facilities team of approximately 25 staff and coordinated day-to-day service delivery.</w:t>
       </w:r>
     </w:p>
     <w:p>
       <w:pPr>
         <w:pStyle w:val="ListBullet"/>
-        <w:spacing w:after="40"/>
+        <w:spacing w:after="20"/>
         <w:ind w:left="259" w:hanging="173"/>
       </w:pPr>
       <w:r>
-        <w:t>Managed a 25-person facilities team comprising 3 engineers, 4 supervisors, and technicians/workers.</w:t>
+        <w:t>Coordinated tenant fit-outs, maintenance activities, shop drawings, material approvals, testing, snagging and handover.</w:t>
       </w:r>
     </w:p>
     <w:p>
       <w:pPr>
         <w:pStyle w:val="ListBullet"/>
-        <w:spacing w:after="40"/>
+        <w:spacing w:after="20"/>
         <w:ind w:left="259" w:hanging="173"/>
       </w:pPr>
       <w:r>
-        <w:t>Supervised tenant fit-outs and coordinated with retail brands and tenants including Vodafone, Seif Pharmacy, Smart Furniture, National Bank of Egypt, Adidas, Active, 2B, Tseppas, and others.</w:t>
+        <w:t>Managed maintenance budgets, service contracts, utilities, suppliers and contractor performance.</w:t>
       </w:r>
     </w:p>
     <w:p>
       <w:pPr>
         <w:pStyle w:val="ListBullet"/>
-        <w:spacing w:after="40"/>
+        <w:spacing w:after="20"/>
         <w:ind w:left="259" w:hanging="173"/>
       </w:pPr>
       <w:r>
-        <w:t>Reviewed shop drawings and material submissions, followed MEP testing and handover, and coordinated with tenants, contractors and consultants.</w:t>
+        <w:t>Oversaw a maintenance contract valued at approximately EGP 150,000 and supported inventory/process improvements.</w:t>
       </w:r>
     </w:p>
     <w:p>
       <w:pPr>
         <w:pStyle w:val="ListBullet"/>
-        <w:spacing w:after="40"/>
+        <w:spacing w:after="20"/>
         <w:ind w:left="259" w:hanging="173"/>
       </w:pPr>
       <w:r>
-        <w:t>Reviewed maintenance contractor performance using response and repair speed, complaint handling, and preventive-maintenance adequacy; oversaw a monthly maintenance contract of approximately EGP 150,000.</w:t>
+        <w:t>Coordinated works and tenant requirements across mall operations while maintaining safety and service continuity.</w:t>
       </w:r>
     </w:p>
     <w:p>
       <w:pPr>
-        <w:pStyle w:val="ListBullet"/>
-        <w:spacing w:after="40"/>
-        <w:ind w:left="259" w:hanging="173"/>
-      </w:pPr>
-      <w:r>
-        <w:t>Created an Excel and paper-based store inventory process to track incoming, outgoing and returned items and improve stock control.</w:t>
-      </w:r>
-    </w:p>
-    <w:p>
-      <w:pPr>
-        <w:spacing w:before="100" w:after="0"/>
+        <w:keepNext/>
+        <w:spacing w:before="90" w:after="0"/>
       </w:pPr>
       <w:r>
         <w:rPr>
           <w:b/>
-          <w:color w:val="17324D"/>
-          <w:sz w:val="20"/>
+          <w:color w:val="14354C"/>
         </w:rPr>
-        <w:t>Hyper One Trading Company</w:t>
+        <w:t>HYPER ONE TRADING COMPANY</w:t>
       </w:r>
       <w:r>
         <w:rPr>
           <w:i/>
-          <w:color w:val="5A646E"/>
-          <w:sz w:val="17"/>
+          <w:sz w:val="16"/>
         </w:rPr>
         <w:t xml:space="preserve">  |  Nov 2016 – Jan 2017</w:t>
       </w:r>
     </w:p>
     <w:p>
       <w:pPr>
-        <w:spacing w:after="40"/>
+        <w:keepNext/>
+        <w:spacing w:after="30"/>
       </w:pPr>
       <w:r>
         <w:rPr>
           <w:b/>
-          <w:color w:val="087E8B"/>
         </w:rPr>
         <w:t>Facilities Management Supervisor</w:t>
       </w:r>
@@ -651,62 +417,42 @@
     <w:p>
       <w:pPr>
         <w:pStyle w:val="ListBullet"/>
-        <w:spacing w:after="40"/>
+        <w:keepNext/>
+        <w:spacing w:after="20"/>
         <w:ind w:left="259" w:hanging="173"/>
       </w:pPr>
       <w:r>
-        <w:t>Supervised facility maintenance activities and site inspections.</w:t>
+        <w:t>Supervised day-to-day facilities activities and coordinated maintenance support and service requests.</w:t>
       </w:r>
     </w:p>
     <w:p>
       <w:pPr>
-        <w:pStyle w:val="ListBullet"/>
-        <w:spacing w:after="40"/>
-        <w:ind w:left="259" w:hanging="173"/>
-      </w:pPr>
-      <w:r>
-        <w:t>Followed up on safety compliance and vendor/service-provider coordination.</w:t>
-      </w:r>
-    </w:p>
-    <w:p>
-      <w:pPr>
-        <w:pStyle w:val="ListBullet"/>
-        <w:spacing w:after="40"/>
-        <w:ind w:left="259" w:hanging="173"/>
-      </w:pPr>
-      <w:r>
-        <w:t>Supported maintenance-contract and cost monitoring.</w:t>
-      </w:r>
-    </w:p>
-    <w:p>
-      <w:pPr>
-        <w:spacing w:before="100" w:after="0"/>
+        <w:keepNext/>
+        <w:spacing w:before="90" w:after="0"/>
       </w:pPr>
       <w:r>
         <w:rPr>
           <w:b/>
-          <w:color w:val="17324D"/>
-          <w:sz w:val="20"/>
+          <w:color w:val="14354C"/>
         </w:rPr>
-        <w:t>Engineering Contracting Office – Ramadan &amp; Hussein Abu Hamid, Assiut</w:t>
+        <w:t>ENGINEERING CONTRACTING OFFICE – RAMADAN &amp; HUSSEIN ABU HAMID</w:t>
       </w:r>
       <w:r>
         <w:rPr>
           <w:i/>
-          <w:color w:val="5A646E"/>
-          <w:sz w:val="17"/>
+          <w:sz w:val="16"/>
         </w:rPr>
         <w:t xml:space="preserve">  |  Nov 2014 – Aug 2016</w:t>
       </w:r>
     </w:p>
     <w:p>
       <w:pPr>
-        <w:spacing w:after="40"/>
+        <w:keepNext/>
+        <w:spacing w:after="30"/>
       </w:pPr>
       <w:r>
         <w:rPr>
           <w:b/>
-          <w:color w:val="087E8B"/>
         </w:rPr>
         <w:t>Electrical / Equipment Maintenance Engineer</w:t>
       </w:r>
@@ -714,52 +460,42 @@
     <w:p>
       <w:pPr>
         <w:pStyle w:val="ListBullet"/>
-        <w:spacing w:after="40"/>
+        <w:keepNext/>
+        <w:spacing w:after="20"/>
         <w:ind w:left="259" w:hanging="173"/>
       </w:pPr>
       <w:r>
-        <w:t>Handled maintenance activities for asphalt mixers, stone crushers and road-paving equipment.</w:t>
+        <w:t>Supported electrical and equipment maintenance activities, troubleshooting and operational reliability.</w:t>
       </w:r>
     </w:p>
     <w:p>
       <w:pPr>
-        <w:pStyle w:val="ListBullet"/>
-        <w:spacing w:after="40"/>
-        <w:ind w:left="259" w:hanging="173"/>
-      </w:pPr>
-      <w:r>
-        <w:t>Supported equipment installation and maintenance, troubleshooting, and operational readiness.</w:t>
-      </w:r>
-    </w:p>
-    <w:p>
-      <w:pPr>
-        <w:spacing w:before="100" w:after="0"/>
+        <w:keepNext/>
+        <w:spacing w:before="90" w:after="0"/>
       </w:pPr>
       <w:r>
         <w:rPr>
           <w:b/>
-          <w:color w:val="17324D"/>
-          <w:sz w:val="20"/>
+          <w:color w:val="14354C"/>
         </w:rPr>
-        <w:t>International Contracting Company (Muntaser)</w:t>
+        <w:t>INTERNATIONAL CONTRACTING COMPANY (MUNTASER)</w:t>
       </w:r>
       <w:r>
         <w:rPr>
           <w:i/>
-          <w:color w:val="5A646E"/>
-          <w:sz w:val="17"/>
+          <w:sz w:val="16"/>
         </w:rPr>
         <w:t xml:space="preserve">  |  Nov 2010 – Oct 2014</w:t>
       </w:r>
     </w:p>
     <w:p>
       <w:pPr>
-        <w:spacing w:after="40"/>
+        <w:keepNext/>
+        <w:spacing w:after="30"/>
       </w:pPr>
       <w:r>
         <w:rPr>
           <w:b/>
-          <w:color w:val="087E8B"/>
         </w:rPr>
         <w:t>Electrical Maintenance Engineer</w:t>
       </w:r>
@@ -767,134 +503,117 @@
     <w:p>
       <w:pPr>
         <w:pStyle w:val="ListBullet"/>
-        <w:spacing w:after="40"/>
+        <w:keepNext/>
+        <w:spacing w:after="20"/>
         <w:ind w:left="259" w:hanging="173"/>
       </w:pPr>
       <w:r>
-        <w:t>Maintained public lighting networks in new cities and communities, including Sheikh Zayed, 15 May, El Shorouk and New Taiba City in Luxor.</w:t>
+        <w:t>Performed electrical maintenance and troubleshooting and supported safe, reliable equipment operation.</w:t>
       </w:r>
     </w:p>
     <w:p>
       <w:pPr>
-        <w:pStyle w:val="ListBullet"/>
-        <w:spacing w:after="40"/>
-        <w:ind w:left="259" w:hanging="173"/>
+        <w:keepNext/>
+        <w:spacing w:before="120" w:after="40"/>
       </w:pPr>
       <w:r>
-        <w:t>Supervised selected lighting-network and feeder execution activities and supported inspections and maintenance.</w:t>
+        <w:rPr>
+          <w:b/>
+          <w:color w:val="146677"/>
+          <w:sz w:val="19"/>
+        </w:rPr>
+        <w:t>EDUCATION</w:t>
       </w:r>
     </w:p>
     <w:p>
       <w:pPr>
-        <w:pStyle w:val="Heading1"/>
+        <w:keepNext/>
+        <w:spacing w:after="20"/>
       </w:pPr>
       <w:r>
-        <w:t>EDUCATION</w:t>
+        <w:rPr>
+          <w:b/>
+        </w:rPr>
+        <w:t xml:space="preserve">Bachelor of Industrial Education — </w:t>
       </w:r>
-    </w:p>
-    <w:p>
       <w:r>
-        <w:t>Bachelor of Industrial Education, Electronics Technology Department — Helwan University | 2009</w:t>
-        <w:br/>
-        <w:t>Graduation project: Design of a Miniature Laboratory System for Voltage and Current Measurements | Grade: Excellent</w:t>
+        <w:t>Electronics Technology Department, Helwan University | 2009</w:t>
       </w:r>
     </w:p>
     <w:p>
       <w:pPr>
-        <w:pStyle w:val="Heading1"/>
+        <w:keepNext/>
+        <w:spacing w:after="20"/>
       </w:pPr>
       <w:r>
+        <w:rPr>
+          <w:b/>
+        </w:rPr>
+        <w:t xml:space="preserve">Graduation Project — </w:t>
+      </w:r>
+      <w:r>
+        <w:t>Miniature laboratory system for voltage/current measurement | Excellent</w:t>
+      </w:r>
+    </w:p>
+    <w:p>
+      <w:pPr>
+        <w:keepNext/>
+        <w:spacing w:before="120" w:after="40"/>
+      </w:pPr>
+      <w:r>
+        <w:rPr>
+          <w:b/>
+          <w:color w:val="146677"/>
+          <w:sz w:val="19"/>
+        </w:rPr>
         <w:t>PROFESSIONAL DEVELOPMENT</w:t>
       </w:r>
     </w:p>
     <w:p>
       <w:pPr>
         <w:pStyle w:val="ListBullet"/>
-        <w:spacing w:after="40"/>
-        <w:ind w:left="259" w:hanging="173"/>
+        <w:spacing w:after="20"/>
       </w:pPr>
       <w:r>
-        <w:t>Applied Supervisory Professional Diploma — AUC School of Continuing Education | Nov 2022 – Nov 2023 | 210 contact hours</w:t>
+        <w:t>Applied Supervisory Professional Diploma, AUC School of Continuing Education | Nov 2022 – Nov 2023 | 210 hours</w:t>
       </w:r>
     </w:p>
     <w:p>
       <w:pPr>
         <w:pStyle w:val="ListBullet"/>
-        <w:spacing w:after="40"/>
-        <w:ind w:left="259" w:hanging="173"/>
+        <w:spacing w:after="20"/>
       </w:pPr>
       <w:r>
-        <w:t>Project Management Foundations — LinkedIn Learning | Dec 2023</w:t>
+        <w:t>Professional development courses via LinkedIn Learning | 2023–2025</w:t>
       </w:r>
     </w:p>
     <w:p>
       <w:pPr>
-        <w:pStyle w:val="ListBullet"/>
-        <w:spacing w:after="40"/>
-        <w:ind w:left="259" w:hanging="173"/>
+        <w:keepNext/>
+        <w:spacing w:before="120" w:after="40"/>
       </w:pPr>
       <w:r>
-        <w:t>Construction Management: Concrete Construction — LinkedIn Learning | Mar 2024</w:t>
-      </w:r>
-    </w:p>
-    <w:p>
-      <w:pPr>
-        <w:pStyle w:val="ListBullet"/>
-        <w:spacing w:after="40"/>
-        <w:ind w:left="259" w:hanging="173"/>
-      </w:pPr>
-      <w:r>
-        <w:t>Construction Management: Introduction to Lean Construction — LinkedIn Learning | Feb 2024</w:t>
-      </w:r>
-    </w:p>
-    <w:p>
-      <w:pPr>
-        <w:pStyle w:val="ListBullet"/>
-        <w:spacing w:after="40"/>
-        <w:ind w:left="259" w:hanging="173"/>
-      </w:pPr>
-      <w:r>
-        <w:t>Project Management Foundations: Budgets, Requirements, Risk, Schedules and Teams — LinkedIn Learning | 2024</w:t>
-      </w:r>
-    </w:p>
-    <w:p>
-      <w:pPr>
-        <w:pStyle w:val="ListBullet"/>
-        <w:spacing w:after="40"/>
-        <w:ind w:left="259" w:hanging="173"/>
-      </w:pPr>
-      <w:r>
-        <w:t>Managing Project Stakeholders; Collaborating with Microsoft 365 — LinkedIn Learning | 2024</w:t>
-      </w:r>
-    </w:p>
-    <w:p>
-      <w:pPr>
-        <w:pStyle w:val="ListBullet"/>
-        <w:spacing w:after="40"/>
-        <w:ind w:left="259" w:hanging="173"/>
-      </w:pPr>
-      <w:r>
-        <w:t>Administrative Professional Foundations — LinkedIn Learning | Feb 2025</w:t>
-      </w:r>
-    </w:p>
-    <w:p>
-      <w:pPr>
-        <w:pStyle w:val="Heading1"/>
-      </w:pPr>
-      <w:r>
+        <w:rPr>
+          <w:b/>
+          <w:color w:val="146677"/>
+          <w:sz w:val="19"/>
+        </w:rPr>
         <w:t>TOOLS &amp; LANGUAGES</w:t>
       </w:r>
     </w:p>
     <w:p>
       <w:r>
         <w:t>Tools: AutoCAD, Microsoft Excel, Word and PowerPoint.</w:t>
-        <w:br/>
-        <w:t>Arabic: Native | English: Good</w:t>
+      </w:r>
+    </w:p>
+    <w:p>
+      <w:r>
+        <w:t>Arabic: Native  |  English: Good</w:t>
       </w:r>
     </w:p>
     <w:sectPr>
       <w:pgSz w:w="12240" w:h="15840"/>
-      <w:pgMar w:top="792" w:right="979" w:bottom="792" w:left="979" w:header="720" w:footer="720" w:gutter="0"/>
+      <w:pgMar w:top="720" w:right="936" w:bottom="720" w:left="936" w:header="720" w:footer="720" w:gutter="0"/>
       <w:cols w:space="720"/>
       <w:docGrid w:linePitch="360"/>
     </w:sectPr>
@@ -1266,11 +985,11 @@
     <w:qFormat/>
     <w:rsid w:val="00FC693F"/>
     <w:pPr>
-      <w:spacing w:after="60"/>
+      <w:spacing w:after="30"/>
     </w:pPr>
     <w:rPr>
       <w:rFonts w:ascii="Aptos" w:hAnsi="Aptos"/>
-      <w:color w:val="323B46"/>
+      <w:color w:val="2D3741"/>
       <w:sz w:val="18"/>
     </w:rPr>
   </w:style>
@@ -1333,10 +1052,10 @@
       <w:outlineLvl w:val="0"/>
     </w:pPr>
     <w:rPr>
-      <w:rFonts w:asciiTheme="majorHAnsi" w:eastAsiaTheme="majorEastAsia" w:hAnsiTheme="majorHAnsi" w:cstheme="majorBidi" w:ascii="Aptos Display" w:hAnsi="Aptos Display"/>
+      <w:rFonts w:asciiTheme="majorHAnsi" w:eastAsiaTheme="majorEastAsia" w:hAnsiTheme="majorHAnsi" w:cstheme="majorBidi"/>
       <w:b/>
       <w:bCs/>
-      <w:color w:val="17324D"/>
+      <w:color w:val="365F91" w:themeColor="accent1" w:themeShade="BF"/>
       <w:sz w:val="28"/>
       <w:szCs w:val="28"/>
     </w:rPr>
@@ -1357,11 +1076,11 @@
       <w:outlineLvl w:val="1"/>
     </w:pPr>
     <w:rPr>
-      <w:rFonts w:asciiTheme="majorHAnsi" w:eastAsiaTheme="majorEastAsia" w:hAnsiTheme="majorHAnsi" w:cstheme="majorBidi" w:ascii="Aptos Display" w:hAnsi="Aptos Display"/>
+      <w:rFonts w:asciiTheme="majorHAnsi" w:eastAsiaTheme="majorEastAsia" w:hAnsiTheme="majorHAnsi" w:cstheme="majorBidi"/>
       <w:b/>
       <w:bCs/>
-      <w:color w:val="087E8B"/>
-      <w:sz w:val="21"/>
+      <w:color w:val="4F81BD" w:themeColor="accent1"/>
+      <w:sz w:val="26"/>
       <w:szCs w:val="26"/>
     </w:rPr>
   </w:style>
@@ -1622,12 +1341,11 @@
       <w:contextualSpacing/>
     </w:pPr>
     <w:rPr>
-      <w:rFonts w:asciiTheme="majorHAnsi" w:eastAsiaTheme="majorEastAsia" w:hAnsiTheme="majorHAnsi" w:cstheme="majorBidi" w:ascii="Aptos Display" w:hAnsi="Aptos Display"/>
-      <w:b/>
-      <w:color w:val="17324D"/>
+      <w:rFonts w:asciiTheme="majorHAnsi" w:eastAsiaTheme="majorEastAsia" w:hAnsiTheme="majorHAnsi" w:cstheme="majorBidi"/>
+      <w:color w:val="17365D" w:themeColor="text2" w:themeShade="BF"/>
       <w:spacing w:val="5"/>
       <w:kern w:val="28"/>
-      <w:sz w:val="46"/>
+      <w:sz w:val="52"/>
       <w:szCs w:val="52"/>
     </w:rPr>
   </w:style>

</xml_diff>